<commit_message>
docs: refine TxID README and submission presentation
</commit_message>
<xml_diff>
--- a/deliverables/TxID_Bioinformatics_Application_Note_2026-09-20/manuscript.docx
+++ b/deliverables/TxID_Bioinformatics_Application_Note_2026-09-20/manuscript.docx
@@ -30,6 +30,69 @@
     </w:p>
     <w:p>
       <w:pPr>
+        <w:spacing w:before="0" w:after="55" w:line="480" w:lineRule="auto"/>
+      </w:pPr>
+      <w:r>
+        <w:t>[AUTHOR NAMES AND AFFILIATION INDICES]</w:t>
+      </w:r>
+    </w:p>
+    <w:p>
+      <w:pPr>
+        <w:spacing w:before="0" w:after="155" w:line="480" w:lineRule="auto"/>
+      </w:pPr>
+      <w:r>
+        <w:rPr>
+          <w:rFonts w:ascii="Arial" w:hAnsi="Arial" w:eastAsia="Microsoft YaHei"/>
+          <w:lang w:val="en-US" w:eastAsia="zh-CN"/>
+          <w:color w:val="3F3F3F"/>
+        </w:rPr>
+        <w:t>[作者姓名及单位序号]</w:t>
+      </w:r>
+    </w:p>
+    <w:p>
+      <w:pPr>
+        <w:spacing w:before="0" w:after="55" w:line="480" w:lineRule="auto"/>
+      </w:pPr>
+      <w:r>
+        <w:t>[AFFILIATIONS: DEPARTMENT, INSTITUTION, CITY, POSTCODE, COUNTRY]</w:t>
+      </w:r>
+    </w:p>
+    <w:p>
+      <w:pPr>
+        <w:spacing w:before="0" w:after="155" w:line="480" w:lineRule="auto"/>
+      </w:pPr>
+      <w:r>
+        <w:rPr>
+          <w:rFonts w:ascii="Arial" w:hAnsi="Arial" w:eastAsia="Microsoft YaHei"/>
+          <w:lang w:val="en-US" w:eastAsia="zh-CN"/>
+          <w:color w:val="3F3F3F"/>
+        </w:rPr>
+        <w:t>[作者单位：部门、机构、城市、邮编、国家]</w:t>
+      </w:r>
+    </w:p>
+    <w:p>
+      <w:pPr>
+        <w:spacing w:before="0" w:after="55" w:line="480" w:lineRule="auto"/>
+      </w:pPr>
+      <w:r>
+        <w:t>Corresponding author: [CORRESPONDING AUTHOR NAME]</w:t>
+      </w:r>
+    </w:p>
+    <w:p>
+      <w:pPr>
+        <w:spacing w:before="0" w:after="155" w:line="480" w:lineRule="auto"/>
+      </w:pPr>
+      <w:r>
+        <w:rPr>
+          <w:rFonts w:ascii="Arial" w:hAnsi="Arial" w:eastAsia="Microsoft YaHei"/>
+          <w:lang w:val="en-US" w:eastAsia="zh-CN"/>
+          <w:color w:val="3F3F3F"/>
+        </w:rPr>
+        <w:t>通讯作者：[通讯作者姓名]</w:t>
+      </w:r>
+    </w:p>
+    <w:p>
+      <w:pPr>
         <w:spacing w:before="180" w:after="100" w:line="276" w:lineRule="auto"/>
         <w:pStyle w:val="Heading1"/>
         <w:keepNext/>
@@ -104,7 +167,7 @@
         <w:keepNext/>
       </w:pPr>
       <w:r>
-        <w:t>Availability and implementation</w:t>
+        <w:t>Availability and Implementation</w:t>
       </w:r>
     </w:p>
     <w:p>
@@ -126,20 +189,42 @@
         <w:spacing w:before="0" w:after="55" w:line="480" w:lineRule="auto"/>
       </w:pPr>
       <w:r>
-        <w:t>TxID requires Python 3.10 or later, has no runtime dependencies and uses a BSD 3-Clause license. Source code, the versioned specification, tests and installation instructions are supplied in the accompanying TxID 0.1.3 source archive.</w:t>
-      </w:r>
-    </w:p>
-    <w:p>
-      <w:pPr>
-        <w:spacing w:before="0" w:after="155" w:line="480" w:lineRule="auto"/>
-      </w:pPr>
-      <w:r>
-        <w:rPr>
-          <w:rFonts w:ascii="Arial" w:hAnsi="Arial" w:eastAsia="Microsoft YaHei"/>
-          <w:lang w:val="en-US" w:eastAsia="zh-CN"/>
-          <w:color w:val="3F3F3F"/>
-        </w:rPr>
-        <w:t>TxID 需要 Python 3.10 或更新版本，无运行时依赖，采用 BSD 3-Clause 许可证。源代码、版本化规范、测试及安装说明包含在随附的 TxID 0.1.3 源码归档中。</w:t>
+        <w:t xml:space="preserve">TxID is implemented in Python 3.10 or later, has no third-party runtime dependencies and is distributed under the BSD 3-Clause license. Source code, the versioned specification, tests and installation instructions are provided at </w:t>
+      </w:r>
+      <w:hyperlink r:id="rIdLink1" w:history="1">
+        <w:r>
+          <w:t>https://github.com/dawangran/TxID</w:t>
+        </w:r>
+      </w:hyperlink>
+      <w:r>
+        <w:t>.</w:t>
+      </w:r>
+    </w:p>
+    <w:p>
+      <w:pPr>
+        <w:spacing w:before="0" w:after="155" w:line="480" w:lineRule="auto"/>
+      </w:pPr>
+      <w:r>
+        <w:rPr>
+          <w:rFonts w:ascii="Arial" w:hAnsi="Arial" w:eastAsia="Microsoft YaHei"/>
+          <w:lang w:val="en-US" w:eastAsia="zh-CN"/>
+          <w:color w:val="3F3F3F"/>
+        </w:rPr>
+        <w:t xml:space="preserve">TxID 以 Python 实现，需要 Python 3.10 或更新版本，无第三方运行时依赖，采用 BSD 3-Clause 许可证。源代码、版本化规范、测试及安装说明见 </w:t>
+      </w:r>
+      <w:hyperlink r:id="rIdLink1" w:history="1">
+        <w:r>
+          <w:rPr>
+            <w:color w:val="3F3F3F"/>
+          </w:rPr>
+          <w:t>https://github.com/dawangran/TxID</w:t>
+        </w:r>
+      </w:hyperlink>
+      <w:r>
+        <w:rPr>
+          <w:color w:val="3F3F3F"/>
+        </w:rPr>
+        <w:t>。</w:t>
       </w:r>
     </w:p>
     <w:p>
@@ -149,7 +234,7 @@
         <w:keepNext/>
       </w:pPr>
       <w:r>
-        <w:t>Supplementary information</w:t>
+        <w:t>Contact</w:t>
       </w:r>
     </w:p>
     <w:p>
@@ -163,6 +248,51 @@
           <w:rFonts w:ascii="Arial" w:hAnsi="Arial" w:eastAsia="Microsoft YaHei"/>
           <w:lang w:val="en-US" w:eastAsia="zh-CN"/>
         </w:rPr>
+        <w:t>联系方式</w:t>
+      </w:r>
+    </w:p>
+    <w:p>
+      <w:pPr>
+        <w:spacing w:before="0" w:after="55" w:line="480" w:lineRule="auto"/>
+      </w:pPr>
+      <w:r>
+        <w:t>[CONTACT EMAIL]</w:t>
+      </w:r>
+    </w:p>
+    <w:p>
+      <w:pPr>
+        <w:spacing w:before="0" w:after="155" w:line="480" w:lineRule="auto"/>
+      </w:pPr>
+      <w:r>
+        <w:rPr>
+          <w:rFonts w:ascii="Arial" w:hAnsi="Arial" w:eastAsia="Microsoft YaHei"/>
+          <w:lang w:val="en-US" w:eastAsia="zh-CN"/>
+          <w:color w:val="3F3F3F"/>
+        </w:rPr>
+        <w:t>[通讯作者邮箱]</w:t>
+      </w:r>
+    </w:p>
+    <w:p>
+      <w:pPr>
+        <w:spacing w:before="140" w:after="80" w:line="276" w:lineRule="auto"/>
+        <w:pStyle w:val="Heading2"/>
+        <w:keepNext/>
+      </w:pPr>
+      <w:r>
+        <w:t>Supplementary Information</w:t>
+      </w:r>
+    </w:p>
+    <w:p>
+      <w:pPr>
+        <w:spacing w:before="140" w:after="80" w:line="276" w:lineRule="auto"/>
+        <w:pStyle w:val="Heading2"/>
+        <w:keepNext/>
+      </w:pPr>
+      <w:r>
+        <w:rPr>
+          <w:rFonts w:ascii="Arial" w:hAnsi="Arial" w:eastAsia="Microsoft YaHei"/>
+          <w:lang w:val="en-US" w:eastAsia="zh-CN"/>
+        </w:rPr>
         <w:t>补充信息</w:t>
       </w:r>
     </w:p>
@@ -794,7 +924,7 @@
         <w:keepNext/>
       </w:pPr>
       <w:r>
-        <w:t>Data availability</w:t>
+        <w:t>Acknowledgements</w:t>
       </w:r>
     </w:p>
     <w:p>
@@ -808,28 +938,142 @@
           <w:rFonts w:ascii="Arial" w:hAnsi="Arial" w:eastAsia="Microsoft YaHei"/>
           <w:lang w:val="en-US" w:eastAsia="zh-CN"/>
         </w:rPr>
-        <w:t>数据可用性</w:t>
-      </w:r>
-    </w:p>
-    <w:p>
-      <w:pPr>
-        <w:spacing w:before="0" w:after="55" w:line="480" w:lineRule="auto"/>
-      </w:pPr>
-      <w:r>
-        <w:t>The public ENCODE annotations are identified in Table S1; the new read-based case uses ENCFF105WIJ. Numerical source data, input manifests, analysis scripts and the unmodified caller annotations for that case are included in the accompanying reproducibility package.</w:t>
-      </w:r>
-    </w:p>
-    <w:p>
-      <w:pPr>
-        <w:spacing w:before="0" w:after="155" w:line="480" w:lineRule="auto"/>
-      </w:pPr>
-      <w:r>
-        <w:rPr>
-          <w:rFonts w:ascii="Arial" w:hAnsi="Arial" w:eastAsia="Microsoft YaHei"/>
-          <w:lang w:val="en-US" w:eastAsia="zh-CN"/>
-          <w:color w:val="3F3F3F"/>
-        </w:rPr>
-        <w:t>公开 ENCODE 注释的文件登录号列于表 S1；新增基于读段的案例使用 ENCFF105WIJ。数值源数据、输入清单、分析脚本及该案例未经修改的工具输出注释均包含在随附的复现材料包中。</w:t>
+        <w:t>致谢</w:t>
+      </w:r>
+    </w:p>
+    <w:p>
+      <w:pPr>
+        <w:spacing w:before="140" w:after="80" w:line="276" w:lineRule="auto"/>
+        <w:pStyle w:val="Heading2"/>
+        <w:keepNext/>
+      </w:pPr>
+      <w:r>
+        <w:t>Funding</w:t>
+      </w:r>
+    </w:p>
+    <w:p>
+      <w:pPr>
+        <w:spacing w:before="140" w:after="80" w:line="276" w:lineRule="auto"/>
+        <w:pStyle w:val="Heading2"/>
+        <w:keepNext/>
+      </w:pPr>
+      <w:r>
+        <w:rPr>
+          <w:rFonts w:ascii="Arial" w:hAnsi="Arial" w:eastAsia="Microsoft YaHei"/>
+          <w:lang w:val="en-US" w:eastAsia="zh-CN"/>
+        </w:rPr>
+        <w:t>基金支持</w:t>
+      </w:r>
+    </w:p>
+    <w:p>
+      <w:pPr>
+        <w:spacing w:before="0" w:after="55" w:line="480" w:lineRule="auto"/>
+      </w:pPr>
+      <w:r>
+        <w:t>[AUTHOR FUNDING STATEMENT]</w:t>
+      </w:r>
+    </w:p>
+    <w:p>
+      <w:pPr>
+        <w:spacing w:before="0" w:after="155" w:line="480" w:lineRule="auto"/>
+      </w:pPr>
+      <w:r>
+        <w:rPr>
+          <w:rFonts w:ascii="Arial" w:hAnsi="Arial" w:eastAsia="Microsoft YaHei"/>
+          <w:lang w:val="en-US" w:eastAsia="zh-CN"/>
+          <w:color w:val="3F3F3F"/>
+        </w:rPr>
+        <w:t>[作者填写基金支持声明]</w:t>
+      </w:r>
+    </w:p>
+    <w:p>
+      <w:pPr>
+        <w:spacing w:before="140" w:after="80" w:line="276" w:lineRule="auto"/>
+        <w:pStyle w:val="Heading2"/>
+        <w:keepNext/>
+      </w:pPr>
+      <w:r>
+        <w:t>Author contributions</w:t>
+      </w:r>
+    </w:p>
+    <w:p>
+      <w:pPr>
+        <w:spacing w:before="140" w:after="80" w:line="276" w:lineRule="auto"/>
+        <w:pStyle w:val="Heading2"/>
+        <w:keepNext/>
+      </w:pPr>
+      <w:r>
+        <w:rPr>
+          <w:rFonts w:ascii="Arial" w:hAnsi="Arial" w:eastAsia="Microsoft YaHei"/>
+          <w:lang w:val="en-US" w:eastAsia="zh-CN"/>
+        </w:rPr>
+        <w:t>作者贡献</w:t>
+      </w:r>
+    </w:p>
+    <w:p>
+      <w:pPr>
+        <w:spacing w:before="0" w:after="55" w:line="480" w:lineRule="auto"/>
+      </w:pPr>
+      <w:r>
+        <w:t>[AUTHOR CONTRIBUTIONS]</w:t>
+      </w:r>
+    </w:p>
+    <w:p>
+      <w:pPr>
+        <w:spacing w:before="0" w:after="155" w:line="480" w:lineRule="auto"/>
+      </w:pPr>
+      <w:r>
+        <w:rPr>
+          <w:rFonts w:ascii="Arial" w:hAnsi="Arial" w:eastAsia="Microsoft YaHei"/>
+          <w:lang w:val="en-US" w:eastAsia="zh-CN"/>
+          <w:color w:val="3F3F3F"/>
+        </w:rPr>
+        <w:t>[作者填写贡献声明]</w:t>
+      </w:r>
+    </w:p>
+    <w:p>
+      <w:pPr>
+        <w:spacing w:before="140" w:after="80" w:line="276" w:lineRule="auto"/>
+        <w:pStyle w:val="Heading2"/>
+        <w:keepNext/>
+      </w:pPr>
+      <w:r>
+        <w:t>Use of AI tools</w:t>
+      </w:r>
+    </w:p>
+    <w:p>
+      <w:pPr>
+        <w:spacing w:before="140" w:after="80" w:line="276" w:lineRule="auto"/>
+        <w:pStyle w:val="Heading2"/>
+        <w:keepNext/>
+      </w:pPr>
+      <w:r>
+        <w:rPr>
+          <w:rFonts w:ascii="Arial" w:hAnsi="Arial" w:eastAsia="Microsoft YaHei"/>
+          <w:lang w:val="en-US" w:eastAsia="zh-CN"/>
+        </w:rPr>
+        <w:t>AI 工具使用说明</w:t>
+      </w:r>
+    </w:p>
+    <w:p>
+      <w:pPr>
+        <w:spacing w:before="0" w:after="55" w:line="480" w:lineRule="auto"/>
+      </w:pPr>
+      <w:r>
+        <w:t>OpenAI Codex assisted with drafting, translation, code revision and verification workflows. The installed Codex CLI version recorded during final preparation was 0.142.2. [AUTHOR REVIEW STATEMENT]</w:t>
+      </w:r>
+    </w:p>
+    <w:p>
+      <w:pPr>
+        <w:spacing w:before="0" w:after="155" w:line="480" w:lineRule="auto"/>
+      </w:pPr>
+      <w:r>
+        <w:rPr>
+          <w:rFonts w:ascii="Arial" w:hAnsi="Arial" w:eastAsia="Microsoft YaHei"/>
+          <w:lang w:val="en-US" w:eastAsia="zh-CN"/>
+          <w:color w:val="3F3F3F"/>
+        </w:rPr>
+        <w:t>OpenAI Codex 辅助了起草、翻译、代码修订及核验流程。定稿整理时记录的已安装 Codex CLI 版本为 0.142.2。[作者填写实际审核及责任声明]</w:t>
       </w:r>
     </w:p>
     <w:p>
@@ -839,7 +1083,7 @@
         <w:keepNext/>
       </w:pPr>
       <w:r>
-        <w:t>Acknowledgements</w:t>
+        <w:t>Conflict of interest</w:t>
       </w:r>
     </w:p>
     <w:p>
@@ -853,28 +1097,97 @@
           <w:rFonts w:ascii="Arial" w:hAnsi="Arial" w:eastAsia="Microsoft YaHei"/>
           <w:lang w:val="en-US" w:eastAsia="zh-CN"/>
         </w:rPr>
-        <w:t>致谢</w:t>
-      </w:r>
-    </w:p>
-    <w:p>
-      <w:pPr>
-        <w:spacing w:before="0" w:after="55" w:line="480" w:lineRule="auto"/>
-      </w:pPr>
-      <w:r>
-        <w:t>OpenAI Codex assisted with drafting, translation, code revision and verification workflows. Numerical results were taken from retained reports or produced by the recorded computational workflows.</w:t>
-      </w:r>
-    </w:p>
-    <w:p>
-      <w:pPr>
-        <w:spacing w:before="0" w:after="155" w:line="480" w:lineRule="auto"/>
-      </w:pPr>
-      <w:r>
-        <w:rPr>
-          <w:rFonts w:ascii="Arial" w:hAnsi="Arial" w:eastAsia="Microsoft YaHei"/>
-          <w:lang w:val="en-US" w:eastAsia="zh-CN"/>
-          <w:color w:val="3F3F3F"/>
-        </w:rPr>
-        <w:t>OpenAI Codex 辅助了起草、翻译、代码修订及核验流程。数值结果来自保留的报告或所记录计算流程的实际运行。</w:t>
+        <w:t>利益冲突</w:t>
+      </w:r>
+    </w:p>
+    <w:p>
+      <w:pPr>
+        <w:spacing w:before="0" w:after="55" w:line="480" w:lineRule="auto"/>
+      </w:pPr>
+      <w:r>
+        <w:t>[AUTHOR COMPETING-INTEREST STATEMENT]</w:t>
+      </w:r>
+    </w:p>
+    <w:p>
+      <w:pPr>
+        <w:spacing w:before="0" w:after="155" w:line="480" w:lineRule="auto"/>
+      </w:pPr>
+      <w:r>
+        <w:rPr>
+          <w:rFonts w:ascii="Arial" w:hAnsi="Arial" w:eastAsia="Microsoft YaHei"/>
+          <w:lang w:val="en-US" w:eastAsia="zh-CN"/>
+          <w:color w:val="3F3F3F"/>
+        </w:rPr>
+        <w:t>[作者填写利益冲突声明]</w:t>
+      </w:r>
+    </w:p>
+    <w:p>
+      <w:pPr>
+        <w:spacing w:before="180" w:after="100" w:line="276" w:lineRule="auto"/>
+        <w:pStyle w:val="Heading1"/>
+        <w:keepNext/>
+      </w:pPr>
+      <w:r>
+        <w:t>Data availability</w:t>
+      </w:r>
+    </w:p>
+    <w:p>
+      <w:pPr>
+        <w:spacing w:before="180" w:after="100" w:line="276" w:lineRule="auto"/>
+        <w:pStyle w:val="Heading1"/>
+        <w:keepNext/>
+      </w:pPr>
+      <w:r>
+        <w:rPr>
+          <w:rFonts w:ascii="Arial" w:hAnsi="Arial" w:eastAsia="Microsoft YaHei"/>
+          <w:lang w:val="en-US" w:eastAsia="zh-CN"/>
+        </w:rPr>
+        <w:t>数据可用性</w:t>
+      </w:r>
+    </w:p>
+    <w:p>
+      <w:pPr>
+        <w:spacing w:before="0" w:after="55" w:line="480" w:lineRule="auto"/>
+      </w:pPr>
+      <w:r>
+        <w:t xml:space="preserve">Public ENCODE input accessions are listed in Table S1; the real-read case uses ENCFF105WIJ. Numerical source data, input manifests, analysis scripts and unmodified caller annotations are provided in the </w:t>
+      </w:r>
+      <w:hyperlink r:id="rIdLink2" w:history="1">
+        <w:r>
+          <w:t>versioned reproducibility materials</w:t>
+        </w:r>
+      </w:hyperlink>
+      <w:r>
+        <w:t>.</w:t>
+      </w:r>
+    </w:p>
+    <w:p>
+      <w:pPr>
+        <w:spacing w:before="0" w:after="155" w:line="480" w:lineRule="auto"/>
+      </w:pPr>
+      <w:r>
+        <w:rPr>
+          <w:rFonts w:ascii="Arial" w:hAnsi="Arial" w:eastAsia="Microsoft YaHei"/>
+          <w:lang w:val="en-US" w:eastAsia="zh-CN"/>
+          <w:color w:val="3F3F3F"/>
+        </w:rPr>
+        <w:t>公开 ENCODE 输入数据的登录号列于表 S1；真实读段案例使用 ENCFF105WIJ。数值源数据、输入清单、分析脚本及未经修改的工具输出注释见</w:t>
+      </w:r>
+      <w:hyperlink r:id="rIdLink2" w:history="1">
+        <w:r>
+          <w:rPr>
+            <w:rFonts w:ascii="Arial" w:hAnsi="Arial" w:eastAsia="Microsoft YaHei"/>
+            <w:lang w:val="en-US" w:eastAsia="zh-CN"/>
+            <w:color w:val="3F3F3F"/>
+          </w:rPr>
+          <w:t>固定版本的复现材料</w:t>
+        </w:r>
+      </w:hyperlink>
+      <w:r>
+        <w:rPr>
+          <w:color w:val="3F3F3F"/>
+        </w:rPr>
+        <w:t>。</w:t>
       </w:r>
     </w:p>
     <w:p>
@@ -1016,241 +1329,499 @@
         <w:spacing w:before="0" w:after="55" w:line="480" w:lineRule="auto"/>
       </w:pPr>
       <w:r>
-        <w:t>ENCODE Project Consortium, Moore JE, Purcaro MJ et al. Expanded encyclopaedias of DNA elements in the human and mouse genomes. Nature 2020;583:699–710. doi:10.1038/s41586-020-2493-4 (https://doi.org/10.1038/s41586-020-2493-4).</w:t>
-      </w:r>
-    </w:p>
-    <w:p>
-      <w:pPr>
-        <w:spacing w:before="0" w:after="155" w:line="480" w:lineRule="auto"/>
-      </w:pPr>
-      <w:r>
-        <w:rPr>
-          <w:rFonts w:ascii="Arial" w:hAnsi="Arial" w:eastAsia="Microsoft YaHei"/>
-          <w:lang w:val="en-US" w:eastAsia="zh-CN"/>
-          <w:color w:val="3F3F3F"/>
-        </w:rPr>
-        <w:t>ENCODE Project Consortium, Moore JE, Purcaro MJ 等 人类和小鼠基因组 DNA 元件百科全书的扩展。 Nature 2020;583:699–710. doi:10.1038/s41586-020-2493-4 (https://doi.org/10.1038/s41586-020-2493-4).</w:t>
-      </w:r>
-    </w:p>
-    <w:p>
-      <w:pPr>
-        <w:spacing w:before="0" w:after="55" w:line="480" w:lineRule="auto"/>
-      </w:pPr>
-      <w:r>
-        <w:t>Jackman SD, Bohlmann J, Birol I. UniqTag: content-derived unique and stable identifiers for gene annotation. PLoS One 2015;10:e0128026. doi:10.1371/journal.pone.0128026 (https://doi.org/10.1371/journal.pone.0128026).</w:t>
-      </w:r>
-    </w:p>
-    <w:p>
-      <w:pPr>
-        <w:spacing w:before="0" w:after="155" w:line="480" w:lineRule="auto"/>
-      </w:pPr>
-      <w:r>
-        <w:rPr>
-          <w:rFonts w:ascii="Arial" w:hAnsi="Arial" w:eastAsia="Microsoft YaHei"/>
-          <w:lang w:val="en-US" w:eastAsia="zh-CN"/>
-          <w:color w:val="3F3F3F"/>
-        </w:rPr>
-        <w:t>Jackman SD, Bohlmann J, Birol I. UniqTag：用于基因注释的、基于内容生成的唯一且稳定的标识符。 PLoS One 2015;10:e0128026. doi:10.1371/journal.pone.0128026 (https://doi.org/10.1371/journal.pone.0128026).</w:t>
-      </w:r>
-    </w:p>
-    <w:p>
-      <w:pPr>
-        <w:spacing w:before="0" w:after="55" w:line="480" w:lineRule="auto"/>
-      </w:pPr>
-      <w:r>
-        <w:t>Kabza M, Ritter A, Byrne A et al. Accurate long-read transcript discovery and quantification at single-cell, pseudo-bulk and bulk resolution with Isosceles. Nat Commun 2024;15:7316. doi:10.1038/s41467-024-51584-3 (https://doi.org/10.1038/s41467-024-51584-3).</w:t>
-      </w:r>
-    </w:p>
-    <w:p>
-      <w:pPr>
-        <w:spacing w:before="0" w:after="155" w:line="480" w:lineRule="auto"/>
-      </w:pPr>
-      <w:r>
-        <w:rPr>
-          <w:rFonts w:ascii="Arial" w:hAnsi="Arial" w:eastAsia="Microsoft YaHei"/>
-          <w:lang w:val="en-US" w:eastAsia="zh-CN"/>
-          <w:color w:val="3F3F3F"/>
-        </w:rPr>
-        <w:t>Kabza M, Ritter A, Byrne A 等 使用 Isosceles 在单细胞、伪 bulk 和 bulk 层面进行准确的长读长转录本发现与定量。 Nat Commun 2024;15:7316. doi:10.1038/s41467-024-51584-3 (https://doi.org/10.1038/s41467-024-51584-3).</w:t>
-      </w:r>
-    </w:p>
-    <w:p>
-      <w:pPr>
-        <w:spacing w:before="0" w:after="55" w:line="480" w:lineRule="auto"/>
-      </w:pPr>
-      <w:r>
-        <w:t>Kovaka S, Zimin AV, Pertea GM et al. Transcriptome assembly from long-read RNA-seq alignments with StringTie2. Genome Biol 2019;20:278. doi:10.1186/s13059-019-1910-1 (https://doi.org/10.1186/s13059-019-1910-1).</w:t>
-      </w:r>
-    </w:p>
-    <w:p>
-      <w:pPr>
-        <w:spacing w:before="0" w:after="155" w:line="480" w:lineRule="auto"/>
-      </w:pPr>
-      <w:r>
-        <w:rPr>
-          <w:rFonts w:ascii="Arial" w:hAnsi="Arial" w:eastAsia="Microsoft YaHei"/>
-          <w:lang w:val="en-US" w:eastAsia="zh-CN"/>
-          <w:color w:val="3F3F3F"/>
-        </w:rPr>
-        <w:t>Kovaka S, Zimin AV, Pertea GM 等 使用 StringTie2 从长读长 RNA-seq 比对结果组装转录组。 Genome Biol 2019;20:278. doi:10.1186/s13059-019-1910-1 (https://doi.org/10.1186/s13059-019-1910-1).</w:t>
-      </w:r>
-    </w:p>
-    <w:p>
-      <w:pPr>
-        <w:spacing w:before="0" w:after="55" w:line="480" w:lineRule="auto"/>
-      </w:pPr>
-      <w:r>
-        <w:t>Liu CS, Chun J. isoSeQL: comparing long-read isoforms across multiple datasets. Bioinformatics 2026;42:btaf680. doi:10.1093/bioinformatics/btaf680 (https://doi.org/10.1093/bioinformatics/btaf680).</w:t>
-      </w:r>
-    </w:p>
-    <w:p>
-      <w:pPr>
-        <w:spacing w:before="0" w:after="155" w:line="480" w:lineRule="auto"/>
-      </w:pPr>
-      <w:r>
-        <w:rPr>
-          <w:rFonts w:ascii="Arial" w:hAnsi="Arial" w:eastAsia="Microsoft YaHei"/>
-          <w:lang w:val="en-US" w:eastAsia="zh-CN"/>
-          <w:color w:val="3F3F3F"/>
-        </w:rPr>
-        <w:t>Liu CS, Chun J. isoSeQL：跨多个数据集比较长读长转录本异构体。 Bioinformatics 2026;42:btaf680. doi:10.1093/bioinformatics/btaf680 (https://doi.org/10.1093/bioinformatics/btaf680).</w:t>
-      </w:r>
-    </w:p>
-    <w:p>
-      <w:pPr>
-        <w:spacing w:before="0" w:after="55" w:line="480" w:lineRule="auto"/>
-      </w:pPr>
-      <w:r>
-        <w:t>Mudge JM, Carbonell-Sala S, Diekhans M et al. GENCODE 2025: reference gene annotation for human and mouse. Nucleic Acids Res 2025;53:D966–D975. doi:10.1093/nar/gkae1078 (https://doi.org/10.1093/nar/gkae1078).</w:t>
-      </w:r>
-    </w:p>
-    <w:p>
-      <w:pPr>
-        <w:spacing w:before="0" w:after="155" w:line="480" w:lineRule="auto"/>
-      </w:pPr>
-      <w:r>
-        <w:rPr>
-          <w:rFonts w:ascii="Arial" w:hAnsi="Arial" w:eastAsia="Microsoft YaHei"/>
-          <w:lang w:val="en-US" w:eastAsia="zh-CN"/>
-          <w:color w:val="3F3F3F"/>
-        </w:rPr>
-        <w:t>Mudge JM, Carbonell-Sala S, Diekhans M 等 GENCODE 2025：人类和小鼠的参考基因注释。 Nucleic Acids Res 2025;53:D966–D975. doi:10.1093/nar/gkae1078 (https://doi.org/10.1093/nar/gkae1078).</w:t>
-      </w:r>
-    </w:p>
-    <w:p>
-      <w:pPr>
-        <w:spacing w:before="0" w:after="55" w:line="480" w:lineRule="auto"/>
-      </w:pPr>
-      <w:r>
-        <w:t>Pardo-Palacios FJ, Arzalluz-Luque A, Kondratova L et al. SQANTI3: curation of long-read transcriptomes for accurate identification of known and novel isoforms. Nat Methods 2024;21:793–797. doi:10.1038/s41592-024-02229-2 (https://doi.org/10.1038/s41592-024-02229-2).</w:t>
-      </w:r>
-    </w:p>
-    <w:p>
-      <w:pPr>
-        <w:spacing w:before="0" w:after="155" w:line="480" w:lineRule="auto"/>
-      </w:pPr>
-      <w:r>
-        <w:rPr>
-          <w:rFonts w:ascii="Arial" w:hAnsi="Arial" w:eastAsia="Microsoft YaHei"/>
-          <w:lang w:val="en-US" w:eastAsia="zh-CN"/>
-          <w:color w:val="3F3F3F"/>
-        </w:rPr>
-        <w:t>Pardo-Palacios FJ, Arzalluz-Luque A, Kondratova L 等 SQANTI3：通过长读长转录组整理准确识别已知和新转录本异构体。 Nat Methods 2024;21:793–797. doi:10.1038/s41592-024-02229-2 (https://doi.org/10.1038/s41592-024-02229-2).</w:t>
-      </w:r>
-    </w:p>
-    <w:p>
-      <w:pPr>
-        <w:spacing w:before="0" w:after="55" w:line="480" w:lineRule="auto"/>
-      </w:pPr>
-      <w:r>
-        <w:t>Pertea G, Pertea M. GFF Utilities: GffRead and GffCompare [version 2; peer review: 3 approved]. F1000Research 2020;9:304. doi:10.12688/f1000research.23297.2 (https://doi.org/10.12688/f1000research.23297.2).</w:t>
-      </w:r>
-    </w:p>
-    <w:p>
-      <w:pPr>
-        <w:spacing w:before="0" w:after="155" w:line="480" w:lineRule="auto"/>
-      </w:pPr>
-      <w:r>
-        <w:rPr>
-          <w:rFonts w:ascii="Arial" w:hAnsi="Arial" w:eastAsia="Microsoft YaHei"/>
-          <w:lang w:val="en-US" w:eastAsia="zh-CN"/>
-          <w:color w:val="3F3F3F"/>
-        </w:rPr>
-        <w:t>Pertea G, Pertea M. GFF 工具集：GffRead 和 GffCompare［版本 2；同行评审：3 项通过］。 F1000Research 2020;9:304. doi:10.12688/f1000research.23297.2 (https://doi.org/10.12688/f1000research.23297.2).</w:t>
-      </w:r>
-    </w:p>
-    <w:p>
-      <w:pPr>
-        <w:spacing w:before="0" w:after="55" w:line="480" w:lineRule="auto"/>
-      </w:pPr>
-      <w:r>
-        <w:t>Prjibelski AD, Mikheenko A, Joglekar A et al. Accurate isoform discovery with IsoQuant using long reads. Nat Biotechnol 2023;41:915–918. doi:10.1038/s41587-022-01565-y (https://doi.org/10.1038/s41587-022-01565-y).</w:t>
-      </w:r>
-    </w:p>
-    <w:p>
-      <w:pPr>
-        <w:spacing w:before="0" w:after="155" w:line="480" w:lineRule="auto"/>
-      </w:pPr>
-      <w:r>
-        <w:rPr>
-          <w:rFonts w:ascii="Arial" w:hAnsi="Arial" w:eastAsia="Microsoft YaHei"/>
-          <w:lang w:val="en-US" w:eastAsia="zh-CN"/>
-          <w:color w:val="3F3F3F"/>
-        </w:rPr>
-        <w:t>Prjibelski AD, Mikheenko A, Joglekar A 等 使用 IsoQuant 从长读长测序数据中准确发现转录本异构体。 Nat Biotechnol 2023;41:915–918. doi:10.1038/s41587-022-01565-y (https://doi.org/10.1038/s41587-022-01565-y).</w:t>
-      </w:r>
-    </w:p>
-    <w:p>
-      <w:pPr>
-        <w:spacing w:before="0" w:after="55" w:line="480" w:lineRule="auto"/>
-      </w:pPr>
-      <w:r>
-        <w:t>Wagner AH, Babb L, Alterovitz G et al. The GA4GH Variation Representation Specification: a computational framework for variation representation and federated identification. Cell Genom 2021;1:100027. doi:10.1016/j.xgen.2021.100027 (https://doi.org/10.1016/j.xgen.2021.100027).</w:t>
-      </w:r>
-    </w:p>
-    <w:p>
-      <w:pPr>
-        <w:spacing w:before="0" w:after="155" w:line="480" w:lineRule="auto"/>
-      </w:pPr>
-      <w:r>
-        <w:rPr>
-          <w:rFonts w:ascii="Arial" w:hAnsi="Arial" w:eastAsia="Microsoft YaHei"/>
-          <w:lang w:val="en-US" w:eastAsia="zh-CN"/>
-          <w:color w:val="3F3F3F"/>
-        </w:rPr>
-        <w:t>Wagner AH, Babb L, Alterovitz G 等 GA4GH 变异表示规范：用于变异表示与联合标识的计算框架。 Cell Genom 2021;1:100027. doi:10.1016/j.xgen.2021.100027 (https://doi.org/10.1016/j.xgen.2021.100027).</w:t>
-      </w:r>
-    </w:p>
-    <w:p>
-      <w:pPr>
-        <w:spacing w:before="0" w:after="55" w:line="480" w:lineRule="auto"/>
-      </w:pPr>
-      <w:r>
-        <w:t>Wyman D, Balderrama-Gutierrez G, Reese F et al. A technology-agnostic long-read analysis pipeline for transcriptome discovery and quantification. bioRxiv 2020;672931, version 2, posted 24 March 2020. doi:10.1101/672931 (https://doi.org/10.1101/672931).</w:t>
-      </w:r>
-    </w:p>
-    <w:p>
-      <w:pPr>
-        <w:spacing w:before="0" w:after="155" w:line="480" w:lineRule="auto"/>
-      </w:pPr>
-      <w:r>
-        <w:rPr>
-          <w:rFonts w:ascii="Arial" w:hAnsi="Arial" w:eastAsia="Microsoft YaHei"/>
-          <w:lang w:val="en-US" w:eastAsia="zh-CN"/>
-          <w:color w:val="3F3F3F"/>
-        </w:rPr>
-        <w:t>Wyman D, Balderrama-Gutierrez G, Reese F 等 一种不依赖特定测序技术的长读长分析流程，用于转录组发现与定量。 bioRxiv 2020;672931, 版本 2，发布于 2020 年 3 月 24 日. doi:10.1101/672931 (https://doi.org/10.1101/672931).</w:t>
+        <w:t xml:space="preserve">ENCODE Project Consortium, Moore JE, Purcaro MJ et al. Expanded encyclopaedias of DNA elements in the human and mouse genomes. Nature 2020;583:699–710. </w:t>
+      </w:r>
+      <w:hyperlink r:id="rIdLink3" w:history="1">
+        <w:r>
+          <w:t>doi:10.1038/s41586-020-2493-4</w:t>
+        </w:r>
+      </w:hyperlink>
+      <w:r>
+        <w:t>.</w:t>
+      </w:r>
+    </w:p>
+    <w:p>
+      <w:pPr>
+        <w:spacing w:before="0" w:after="155" w:line="480" w:lineRule="auto"/>
+      </w:pPr>
+      <w:r>
+        <w:rPr>
+          <w:rFonts w:ascii="Arial" w:hAnsi="Arial" w:eastAsia="Microsoft YaHei"/>
+          <w:lang w:val="en-US" w:eastAsia="zh-CN"/>
+          <w:color w:val="3F3F3F"/>
+        </w:rPr>
+        <w:t xml:space="preserve">ENCODE Project Consortium, Moore JE, Purcaro MJ 等 人类和小鼠基因组 DNA 元件百科全书的扩展。 Nature 2020;583:699–710. </w:t>
+      </w:r>
+      <w:hyperlink r:id="rIdLink3" w:history="1">
+        <w:r>
+          <w:rPr>
+            <w:color w:val="3F3F3F"/>
+          </w:rPr>
+          <w:t>doi:10.1038/s41586-020-2493-4</w:t>
+        </w:r>
+      </w:hyperlink>
+      <w:r>
+        <w:rPr>
+          <w:color w:val="3F3F3F"/>
+        </w:rPr>
+        <w:t>.</w:t>
+      </w:r>
+    </w:p>
+    <w:p>
+      <w:pPr>
+        <w:spacing w:before="0" w:after="55" w:line="480" w:lineRule="auto"/>
+      </w:pPr>
+      <w:r>
+        <w:t xml:space="preserve">Jackman SD, Bohlmann J, Birol I. UniqTag: content-derived unique and stable identifiers for gene annotation. PLoS One 2015;10:e0128026. </w:t>
+      </w:r>
+      <w:hyperlink r:id="rIdLink4" w:history="1">
+        <w:r>
+          <w:t>doi:10.1371/journal.pone.0128026</w:t>
+        </w:r>
+      </w:hyperlink>
+      <w:r>
+        <w:t>.</w:t>
+      </w:r>
+    </w:p>
+    <w:p>
+      <w:pPr>
+        <w:spacing w:before="0" w:after="155" w:line="480" w:lineRule="auto"/>
+      </w:pPr>
+      <w:r>
+        <w:rPr>
+          <w:rFonts w:ascii="Arial" w:hAnsi="Arial" w:eastAsia="Microsoft YaHei"/>
+          <w:lang w:val="en-US" w:eastAsia="zh-CN"/>
+          <w:color w:val="3F3F3F"/>
+        </w:rPr>
+        <w:t xml:space="preserve">Jackman SD, Bohlmann J, Birol I. UniqTag：用于基因注释的、基于内容生成的唯一且稳定的标识符。 PLoS One 2015;10:e0128026. </w:t>
+      </w:r>
+      <w:hyperlink r:id="rIdLink4" w:history="1">
+        <w:r>
+          <w:rPr>
+            <w:color w:val="3F3F3F"/>
+          </w:rPr>
+          <w:t>doi:10.1371/journal.pone.0128026</w:t>
+        </w:r>
+      </w:hyperlink>
+      <w:r>
+        <w:rPr>
+          <w:color w:val="3F3F3F"/>
+        </w:rPr>
+        <w:t>.</w:t>
+      </w:r>
+    </w:p>
+    <w:p>
+      <w:pPr>
+        <w:spacing w:before="0" w:after="55" w:line="480" w:lineRule="auto"/>
+      </w:pPr>
+      <w:r>
+        <w:t xml:space="preserve">Kabza M, Ritter A, Byrne A et al. Accurate long-read transcript discovery and quantification at single-cell, pseudo-bulk and bulk resolution with Isosceles. Nat Commun 2024;15:7316. </w:t>
+      </w:r>
+      <w:hyperlink r:id="rIdLink5" w:history="1">
+        <w:r>
+          <w:t>doi:10.1038/s41467-024-51584-3</w:t>
+        </w:r>
+      </w:hyperlink>
+      <w:r>
+        <w:t>.</w:t>
+      </w:r>
+    </w:p>
+    <w:p>
+      <w:pPr>
+        <w:spacing w:before="0" w:after="155" w:line="480" w:lineRule="auto"/>
+      </w:pPr>
+      <w:r>
+        <w:rPr>
+          <w:rFonts w:ascii="Arial" w:hAnsi="Arial" w:eastAsia="Microsoft YaHei"/>
+          <w:lang w:val="en-US" w:eastAsia="zh-CN"/>
+          <w:color w:val="3F3F3F"/>
+        </w:rPr>
+        <w:t xml:space="preserve">Kabza M, Ritter A, Byrne A 等 使用 Isosceles 在单细胞、伪 bulk 和 bulk 层面进行准确的长读长转录本发现与定量。 Nat Commun 2024;15:7316. </w:t>
+      </w:r>
+      <w:hyperlink r:id="rIdLink5" w:history="1">
+        <w:r>
+          <w:rPr>
+            <w:color w:val="3F3F3F"/>
+          </w:rPr>
+          <w:t>doi:10.1038/s41467-024-51584-3</w:t>
+        </w:r>
+      </w:hyperlink>
+      <w:r>
+        <w:rPr>
+          <w:color w:val="3F3F3F"/>
+        </w:rPr>
+        <w:t>.</w:t>
+      </w:r>
+    </w:p>
+    <w:p>
+      <w:pPr>
+        <w:spacing w:before="0" w:after="55" w:line="480" w:lineRule="auto"/>
+      </w:pPr>
+      <w:r>
+        <w:t xml:space="preserve">Kovaka S, Zimin AV, Pertea GM et al. Transcriptome assembly from long-read RNA-seq alignments with StringTie2. Genome Biol 2019;20:278. </w:t>
+      </w:r>
+      <w:hyperlink r:id="rIdLink6" w:history="1">
+        <w:r>
+          <w:t>doi:10.1186/s13059-019-1910-1</w:t>
+        </w:r>
+      </w:hyperlink>
+      <w:r>
+        <w:t>.</w:t>
+      </w:r>
+    </w:p>
+    <w:p>
+      <w:pPr>
+        <w:spacing w:before="0" w:after="155" w:line="480" w:lineRule="auto"/>
+      </w:pPr>
+      <w:r>
+        <w:rPr>
+          <w:rFonts w:ascii="Arial" w:hAnsi="Arial" w:eastAsia="Microsoft YaHei"/>
+          <w:lang w:val="en-US" w:eastAsia="zh-CN"/>
+          <w:color w:val="3F3F3F"/>
+        </w:rPr>
+        <w:t xml:space="preserve">Kovaka S, Zimin AV, Pertea GM 等 使用 StringTie2 从长读长 RNA-seq 比对结果组装转录组。 Genome Biol 2019;20:278. </w:t>
+      </w:r>
+      <w:hyperlink r:id="rIdLink6" w:history="1">
+        <w:r>
+          <w:rPr>
+            <w:color w:val="3F3F3F"/>
+          </w:rPr>
+          <w:t>doi:10.1186/s13059-019-1910-1</w:t>
+        </w:r>
+      </w:hyperlink>
+      <w:r>
+        <w:rPr>
+          <w:color w:val="3F3F3F"/>
+        </w:rPr>
+        <w:t>.</w:t>
+      </w:r>
+    </w:p>
+    <w:p>
+      <w:pPr>
+        <w:spacing w:before="0" w:after="55" w:line="480" w:lineRule="auto"/>
+      </w:pPr>
+      <w:r>
+        <w:t xml:space="preserve">Liu CS, Chun J. isoSeQL: comparing long-read isoforms across multiple datasets. Bioinformatics 2026;42:btaf680. </w:t>
+      </w:r>
+      <w:hyperlink r:id="rIdLink7" w:history="1">
+        <w:r>
+          <w:t>doi:10.1093/bioinformatics/btaf680</w:t>
+        </w:r>
+      </w:hyperlink>
+      <w:r>
+        <w:t>.</w:t>
+      </w:r>
+    </w:p>
+    <w:p>
+      <w:pPr>
+        <w:spacing w:before="0" w:after="155" w:line="480" w:lineRule="auto"/>
+      </w:pPr>
+      <w:r>
+        <w:rPr>
+          <w:rFonts w:ascii="Arial" w:hAnsi="Arial" w:eastAsia="Microsoft YaHei"/>
+          <w:lang w:val="en-US" w:eastAsia="zh-CN"/>
+          <w:color w:val="3F3F3F"/>
+        </w:rPr>
+        <w:t xml:space="preserve">Liu CS, Chun J. isoSeQL：跨多个数据集比较长读长转录本异构体。 Bioinformatics 2026;42:btaf680. </w:t>
+      </w:r>
+      <w:hyperlink r:id="rIdLink7" w:history="1">
+        <w:r>
+          <w:rPr>
+            <w:color w:val="3F3F3F"/>
+          </w:rPr>
+          <w:t>doi:10.1093/bioinformatics/btaf680</w:t>
+        </w:r>
+      </w:hyperlink>
+      <w:r>
+        <w:rPr>
+          <w:color w:val="3F3F3F"/>
+        </w:rPr>
+        <w:t>.</w:t>
+      </w:r>
+    </w:p>
+    <w:p>
+      <w:pPr>
+        <w:spacing w:before="0" w:after="55" w:line="480" w:lineRule="auto"/>
+      </w:pPr>
+      <w:r>
+        <w:t xml:space="preserve">Mudge JM, Carbonell-Sala S, Diekhans M et al. GENCODE 2025: reference gene annotation for human and mouse. Nucleic Acids Res 2025;53:D966–D975. </w:t>
+      </w:r>
+      <w:hyperlink r:id="rIdLink8" w:history="1">
+        <w:r>
+          <w:t>doi:10.1093/nar/gkae1078</w:t>
+        </w:r>
+      </w:hyperlink>
+      <w:r>
+        <w:t>.</w:t>
+      </w:r>
+    </w:p>
+    <w:p>
+      <w:pPr>
+        <w:spacing w:before="0" w:after="155" w:line="480" w:lineRule="auto"/>
+      </w:pPr>
+      <w:r>
+        <w:rPr>
+          <w:rFonts w:ascii="Arial" w:hAnsi="Arial" w:eastAsia="Microsoft YaHei"/>
+          <w:lang w:val="en-US" w:eastAsia="zh-CN"/>
+          <w:color w:val="3F3F3F"/>
+        </w:rPr>
+        <w:t xml:space="preserve">Mudge JM, Carbonell-Sala S, Diekhans M 等 GENCODE 2025：人类和小鼠的参考基因注释。 Nucleic Acids Res 2025;53:D966–D975. </w:t>
+      </w:r>
+      <w:hyperlink r:id="rIdLink8" w:history="1">
+        <w:r>
+          <w:rPr>
+            <w:color w:val="3F3F3F"/>
+          </w:rPr>
+          <w:t>doi:10.1093/nar/gkae1078</w:t>
+        </w:r>
+      </w:hyperlink>
+      <w:r>
+        <w:rPr>
+          <w:color w:val="3F3F3F"/>
+        </w:rPr>
+        <w:t>.</w:t>
+      </w:r>
+    </w:p>
+    <w:p>
+      <w:pPr>
+        <w:spacing w:before="0" w:after="55" w:line="480" w:lineRule="auto"/>
+      </w:pPr>
+      <w:r>
+        <w:t xml:space="preserve">Pardo-Palacios FJ, Arzalluz-Luque A, Kondratova L et al. SQANTI3: curation of long-read transcriptomes for accurate identification of known and novel isoforms. Nat Methods 2024;21:793–797. </w:t>
+      </w:r>
+      <w:hyperlink r:id="rIdLink9" w:history="1">
+        <w:r>
+          <w:t>doi:10.1038/s41592-024-02229-2</w:t>
+        </w:r>
+      </w:hyperlink>
+      <w:r>
+        <w:t>.</w:t>
+      </w:r>
+    </w:p>
+    <w:p>
+      <w:pPr>
+        <w:spacing w:before="0" w:after="155" w:line="480" w:lineRule="auto"/>
+      </w:pPr>
+      <w:r>
+        <w:rPr>
+          <w:rFonts w:ascii="Arial" w:hAnsi="Arial" w:eastAsia="Microsoft YaHei"/>
+          <w:lang w:val="en-US" w:eastAsia="zh-CN"/>
+          <w:color w:val="3F3F3F"/>
+        </w:rPr>
+        <w:t xml:space="preserve">Pardo-Palacios FJ, Arzalluz-Luque A, Kondratova L 等 SQANTI3：通过长读长转录组整理准确识别已知和新转录本异构体。 Nat Methods 2024;21:793–797. </w:t>
+      </w:r>
+      <w:hyperlink r:id="rIdLink9" w:history="1">
+        <w:r>
+          <w:rPr>
+            <w:color w:val="3F3F3F"/>
+          </w:rPr>
+          <w:t>doi:10.1038/s41592-024-02229-2</w:t>
+        </w:r>
+      </w:hyperlink>
+      <w:r>
+        <w:rPr>
+          <w:color w:val="3F3F3F"/>
+        </w:rPr>
+        <w:t>.</w:t>
+      </w:r>
+    </w:p>
+    <w:p>
+      <w:pPr>
+        <w:spacing w:before="0" w:after="55" w:line="480" w:lineRule="auto"/>
+      </w:pPr>
+      <w:r>
+        <w:t xml:space="preserve">Pertea G, Pertea M. GFF Utilities: GffRead and GffCompare [version 2; peer review: 3 approved]. F1000Research 2020;9:304. </w:t>
+      </w:r>
+      <w:hyperlink r:id="rIdLink10" w:history="1">
+        <w:r>
+          <w:t>doi:10.12688/f1000research.23297.2</w:t>
+        </w:r>
+      </w:hyperlink>
+      <w:r>
+        <w:t>.</w:t>
+      </w:r>
+    </w:p>
+    <w:p>
+      <w:pPr>
+        <w:spacing w:before="0" w:after="155" w:line="480" w:lineRule="auto"/>
+      </w:pPr>
+      <w:r>
+        <w:rPr>
+          <w:rFonts w:ascii="Arial" w:hAnsi="Arial" w:eastAsia="Microsoft YaHei"/>
+          <w:lang w:val="en-US" w:eastAsia="zh-CN"/>
+          <w:color w:val="3F3F3F"/>
+        </w:rPr>
+        <w:t xml:space="preserve">Pertea G, Pertea M. GFF 工具集：GffRead 和 GffCompare［版本 2；同行评审：3 项通过］。 F1000Research 2020;9:304. </w:t>
+      </w:r>
+      <w:hyperlink r:id="rIdLink10" w:history="1">
+        <w:r>
+          <w:rPr>
+            <w:color w:val="3F3F3F"/>
+          </w:rPr>
+          <w:t>doi:10.12688/f1000research.23297.2</w:t>
+        </w:r>
+      </w:hyperlink>
+      <w:r>
+        <w:rPr>
+          <w:color w:val="3F3F3F"/>
+        </w:rPr>
+        <w:t>.</w:t>
+      </w:r>
+    </w:p>
+    <w:p>
+      <w:pPr>
+        <w:spacing w:before="0" w:after="55" w:line="480" w:lineRule="auto"/>
+      </w:pPr>
+      <w:r>
+        <w:t xml:space="preserve">Prjibelski AD, Mikheenko A, Joglekar A et al. Accurate isoform discovery with IsoQuant using long reads. Nat Biotechnol 2023;41:915–918. </w:t>
+      </w:r>
+      <w:hyperlink r:id="rIdLink11" w:history="1">
+        <w:r>
+          <w:t>doi:10.1038/s41587-022-01565-y</w:t>
+        </w:r>
+      </w:hyperlink>
+      <w:r>
+        <w:t>.</w:t>
+      </w:r>
+    </w:p>
+    <w:p>
+      <w:pPr>
+        <w:spacing w:before="0" w:after="155" w:line="480" w:lineRule="auto"/>
+      </w:pPr>
+      <w:r>
+        <w:rPr>
+          <w:rFonts w:ascii="Arial" w:hAnsi="Arial" w:eastAsia="Microsoft YaHei"/>
+          <w:lang w:val="en-US" w:eastAsia="zh-CN"/>
+          <w:color w:val="3F3F3F"/>
+        </w:rPr>
+        <w:t xml:space="preserve">Prjibelski AD, Mikheenko A, Joglekar A 等 使用 IsoQuant 从长读长测序数据中准确发现转录本异构体。 Nat Biotechnol 2023;41:915–918. </w:t>
+      </w:r>
+      <w:hyperlink r:id="rIdLink11" w:history="1">
+        <w:r>
+          <w:rPr>
+            <w:color w:val="3F3F3F"/>
+          </w:rPr>
+          <w:t>doi:10.1038/s41587-022-01565-y</w:t>
+        </w:r>
+      </w:hyperlink>
+      <w:r>
+        <w:rPr>
+          <w:color w:val="3F3F3F"/>
+        </w:rPr>
+        <w:t>.</w:t>
+      </w:r>
+    </w:p>
+    <w:p>
+      <w:pPr>
+        <w:spacing w:before="0" w:after="55" w:line="480" w:lineRule="auto"/>
+      </w:pPr>
+      <w:r>
+        <w:t xml:space="preserve">Wagner AH, Babb L, Alterovitz G et al. The GA4GH Variation Representation Specification: a computational framework for variation representation and federated identification. Cell Genom 2021;1:100027. </w:t>
+      </w:r>
+      <w:hyperlink r:id="rIdLink12" w:history="1">
+        <w:r>
+          <w:t>doi:10.1016/j.xgen.2021.100027</w:t>
+        </w:r>
+      </w:hyperlink>
+      <w:r>
+        <w:t>.</w:t>
+      </w:r>
+    </w:p>
+    <w:p>
+      <w:pPr>
+        <w:spacing w:before="0" w:after="155" w:line="480" w:lineRule="auto"/>
+      </w:pPr>
+      <w:r>
+        <w:rPr>
+          <w:rFonts w:ascii="Arial" w:hAnsi="Arial" w:eastAsia="Microsoft YaHei"/>
+          <w:lang w:val="en-US" w:eastAsia="zh-CN"/>
+          <w:color w:val="3F3F3F"/>
+        </w:rPr>
+        <w:t xml:space="preserve">Wagner AH, Babb L, Alterovitz G 等 GA4GH 变异表示规范：用于变异表示与联合标识的计算框架。 Cell Genom 2021;1:100027. </w:t>
+      </w:r>
+      <w:hyperlink r:id="rIdLink12" w:history="1">
+        <w:r>
+          <w:rPr>
+            <w:color w:val="3F3F3F"/>
+          </w:rPr>
+          <w:t>doi:10.1016/j.xgen.2021.100027</w:t>
+        </w:r>
+      </w:hyperlink>
+      <w:r>
+        <w:rPr>
+          <w:color w:val="3F3F3F"/>
+        </w:rPr>
+        <w:t>.</w:t>
+      </w:r>
+    </w:p>
+    <w:p>
+      <w:pPr>
+        <w:spacing w:before="0" w:after="55" w:line="480" w:lineRule="auto"/>
+      </w:pPr>
+      <w:r>
+        <w:t xml:space="preserve">Wyman D, Balderrama-Gutierrez G, Reese F et al. A technology-agnostic long-read analysis pipeline for transcriptome discovery and quantification. bioRxiv 2020;672931, version 2, posted 24 March 2020. </w:t>
+      </w:r>
+      <w:hyperlink r:id="rIdLink13" w:history="1">
+        <w:r>
+          <w:t>doi:10.1101/672931</w:t>
+        </w:r>
+      </w:hyperlink>
+      <w:r>
+        <w:t>.</w:t>
+      </w:r>
+    </w:p>
+    <w:p>
+      <w:pPr>
+        <w:spacing w:before="0" w:after="155" w:line="480" w:lineRule="auto"/>
+      </w:pPr>
+      <w:r>
+        <w:rPr>
+          <w:rFonts w:ascii="Arial" w:hAnsi="Arial" w:eastAsia="Microsoft YaHei"/>
+          <w:lang w:val="en-US" w:eastAsia="zh-CN"/>
+          <w:color w:val="3F3F3F"/>
+        </w:rPr>
+        <w:t xml:space="preserve">Wyman D, Balderrama-Gutierrez G, Reese F 等 一种不依赖特定测序技术的长读长分析流程，用于转录组发现与定量。 bioRxiv 2020;672931, 版本 2，发布于 2020 年 3 月 24 日. </w:t>
+      </w:r>
+      <w:hyperlink r:id="rIdLink13" w:history="1">
+        <w:r>
+          <w:rPr>
+            <w:color w:val="3F3F3F"/>
+          </w:rPr>
+          <w:t>doi:10.1101/672931</w:t>
+        </w:r>
+      </w:hyperlink>
+      <w:r>
+        <w:rPr>
+          <w:color w:val="3F3F3F"/>
+        </w:rPr>
+        <w:t>.</w:t>
       </w:r>
     </w:p>
     <w:sectPr>
+      <w:footerReference w:type="default" r:id="rIdPageFooter"/>
       <w:pgSz w:w="11906" w:h="16838"/>
       <w:pgMar w:top="850" w:right="850" w:bottom="850" w:left="850" w:header="500" w:footer="500" w:gutter="0"/>
+      <w:lnNumType w:countBy="1" w:restart="continuous"/>
       <w:cols w:space="708"/>
-      <w:lnNumType w:countBy="1" w:restart="continuous"/>
       <w:docGrid w:linePitch="360"/>
     </w:sectPr>
   </w:body>
 </w:document>
+</file>
+
+<file path=word/footer1.xml><?xml version="1.0" encoding="utf-8"?>
+<w:ftr xmlns:w="http://schemas.openxmlformats.org/wordprocessingml/2006/main">
+  <w:p>
+    <w:pPr>
+      <w:jc w:val="center"/>
+    </w:pPr>
+    <w:fldSimple w:instr="PAGE">
+      <w:r>
+        <w:t>1</w:t>
+      </w:r>
+    </w:fldSimple>
+  </w:p>
+</w:ftr>
 </file>
 
 <file path=word/styles.xml><?xml version="1.0" encoding="utf-8"?>

</xml_diff>